<commit_message>
Update Fingernail Isotopes SOP.docx
</commit_message>
<xml_diff>
--- a/Fingernail Isotopes SOP.docx
+++ b/Fingernail Isotopes SOP.docx
@@ -27,1106 +27,12 @@
     </w:p>
     <w:p>
       <w:pPr>
-        <w:pStyle w:val="NoSpacing"/>
-        <w:rPr>
-          <w:rFonts w:ascii="Times New Roman" w:eastAsia="Times New Roman" w:hAnsi="Times New Roman" w:cs="Times New Roman"/>
+        <w:rPr>
+          <w:rFonts w:ascii="Times" w:eastAsia="Times" w:hAnsi="Times" w:cs="Times"/>
           <w:sz w:val="18"/>
           <w:szCs w:val="18"/>
         </w:rPr>
       </w:pPr>
-      <w:r>
-        <w:rPr>
-          <w:rFonts w:ascii="Times New Roman" w:eastAsia="Times New Roman" w:hAnsi="Times New Roman" w:cs="Times New Roman"/>
-          <w:sz w:val="18"/>
-          <w:szCs w:val="18"/>
-        </w:rPr>
-        <w:t>(Current and Updated Versions Located on the Archaeological Sciences</w:t>
-      </w:r>
-    </w:p>
-    <w:p>
-      <w:pPr>
-        <w:pStyle w:val="NoSpacing"/>
-        <w:rPr>
-          <w:rFonts w:ascii="Times New Roman" w:eastAsia="Times New Roman" w:hAnsi="Times New Roman" w:cs="Times New Roman"/>
-          <w:color w:val="000000" w:themeColor="text1"/>
-          <w:sz w:val="14"/>
-          <w:szCs w:val="14"/>
-        </w:rPr>
-      </w:pPr>
-      <w:r>
-        <w:rPr>
-          <w:rFonts w:ascii="Times New Roman" w:eastAsia="Times New Roman" w:hAnsi="Times New Roman" w:cs="Times New Roman"/>
-          <w:sz w:val="18"/>
-          <w:szCs w:val="18"/>
-        </w:rPr>
-        <w:t xml:space="preserve">Laboratory Shared OneDrive) Last Revised: </w:t>
-      </w:r>
-      <w:r>
-        <w:rPr>
-          <w:rFonts w:ascii="Times New Roman" w:eastAsia="Times New Roman" w:hAnsi="Times New Roman" w:cs="Times New Roman"/>
-          <w:sz w:val="18"/>
-          <w:szCs w:val="18"/>
-        </w:rPr>
-        <w:t>17 February</w:t>
-      </w:r>
-      <w:r>
-        <w:rPr>
-          <w:rFonts w:ascii="Times New Roman" w:eastAsia="Times New Roman" w:hAnsi="Times New Roman" w:cs="Times New Roman"/>
-          <w:sz w:val="18"/>
-          <w:szCs w:val="18"/>
-        </w:rPr>
-        <w:t xml:space="preserve"> </w:t>
-      </w:r>
-      <w:r>
-        <w:rPr>
-          <w:rFonts w:ascii="Times New Roman" w:eastAsia="Times New Roman" w:hAnsi="Times New Roman" w:cs="Times New Roman"/>
-          <w:sz w:val="18"/>
-          <w:szCs w:val="18"/>
-        </w:rPr>
-        <w:t>202</w:t>
-      </w:r>
-      <w:r>
-        <w:rPr>
-          <w:rFonts w:ascii="Times New Roman" w:eastAsia="Times New Roman" w:hAnsi="Times New Roman" w:cs="Times New Roman"/>
-          <w:sz w:val="18"/>
-          <w:szCs w:val="18"/>
-        </w:rPr>
-        <w:t>6</w:t>
-      </w:r>
-    </w:p>
-    <w:p>
-      <w:r>
-        <w:rPr>
-          <w:noProof/>
-        </w:rPr>
-        <w:drawing>
-          <wp:inline distT="0" distB="0" distL="0" distR="0" wp14:anchorId="7FD0AE8F" wp14:editId="6386DFC4">
-            <wp:extent cx="6438900" cy="30956"/>
-            <wp:effectExtent l="0" t="0" r="0" b="0"/>
-            <wp:docPr id="93295954" name="drawing" title="Group 7, Grouped object">
-              <a:extLst xmlns:a="http://schemas.openxmlformats.org/drawingml/2006/main">
-                <a:ext uri="{FF2B5EF4-FFF2-40B4-BE49-F238E27FC236}">
-                  <a16:creationId xmlns:a16="http://schemas.microsoft.com/office/drawing/2014/main" id="{32B765A0-B290-486C-A289-296B2031906F}"/>
-                </a:ext>
-              </a:extLst>
-            </wp:docPr>
-            <wp:cNvGraphicFramePr>
-              <a:graphicFrameLocks xmlns:a="http://schemas.openxmlformats.org/drawingml/2006/main" noChangeAspect="1"/>
-            </wp:cNvGraphicFramePr>
-            <a:graphic xmlns:a="http://schemas.openxmlformats.org/drawingml/2006/main">
-              <a:graphicData uri="http://schemas.openxmlformats.org/drawingml/2006/picture">
-                <pic:pic xmlns:pic="http://schemas.openxmlformats.org/drawingml/2006/picture">
-                  <pic:nvPicPr>
-                    <pic:cNvPr id="93295954" name="Picture 93295954"/>
-                    <pic:cNvPicPr/>
-                  </pic:nvPicPr>
-                  <pic:blipFill>
-                    <a:blip r:embed="rId7">
-                      <a:extLst>
-                        <a:ext uri="{28A0092B-C50C-407E-A947-70E740481C1C}">
-                          <a14:useLocalDpi xmlns:a14="http://schemas.microsoft.com/office/drawing/2010/main"/>
-                        </a:ext>
-                      </a:extLst>
-                    </a:blip>
-                    <a:stretch>
-                      <a:fillRect/>
-                    </a:stretch>
-                  </pic:blipFill>
-                  <pic:spPr>
-                    <a:xfrm>
-                      <a:off x="0" y="0"/>
-                      <a:ext cx="6438900" cy="30956"/>
-                    </a:xfrm>
-                    <a:prstGeom prst="rect">
-                      <a:avLst/>
-                    </a:prstGeom>
-                  </pic:spPr>
-                </pic:pic>
-              </a:graphicData>
-            </a:graphic>
-          </wp:inline>
-        </w:drawing>
-      </w:r>
-    </w:p>
-    <w:p>
-      <w:pPr>
-        <w:rPr>
-          <w:rFonts w:ascii="Times" w:eastAsia="Times" w:hAnsi="Times" w:cs="Times"/>
-          <w:sz w:val="18"/>
-          <w:szCs w:val="18"/>
-        </w:rPr>
-      </w:pPr>
-      <w:r>
-        <w:rPr>
-          <w:rFonts w:ascii="Times" w:eastAsia="Times" w:hAnsi="Times" w:cs="Times"/>
-          <w:sz w:val="18"/>
-          <w:szCs w:val="18"/>
-        </w:rPr>
-        <w:t>CONTENTS</w:t>
-      </w:r>
-    </w:p>
-    <w:p>
-      <w:r>
-        <w:rPr>
-          <w:rFonts w:ascii="Times" w:eastAsia="Times" w:hAnsi="Times" w:cs="Times"/>
-          <w:sz w:val="18"/>
-          <w:szCs w:val="18"/>
-        </w:rPr>
-        <w:t>Principle, Spirit, &amp; Intent</w:t>
-      </w:r>
-      <w:r>
-        <w:rPr>
-          <w:rFonts w:ascii="Times" w:eastAsia="Times" w:hAnsi="Times" w:cs="Times"/>
-          <w:sz w:val="18"/>
-          <w:szCs w:val="18"/>
-        </w:rPr>
-        <w:t xml:space="preserve"> </w:t>
-      </w:r>
-      <w:r>
-        <w:tab/>
-      </w:r>
-      <w:r>
-        <w:tab/>
-      </w:r>
-      <w:r>
-        <w:tab/>
-      </w:r>
-      <w:r>
-        <w:tab/>
-      </w:r>
-      <w:r>
-        <w:tab/>
-      </w:r>
-      <w:r>
-        <w:tab/>
-      </w:r>
-      <w:r>
-        <w:tab/>
-      </w:r>
-      <w:r>
-        <w:tab/>
-      </w:r>
-      <w:r>
-        <w:tab/>
-      </w:r>
-      <w:r>
-        <w:rPr>
-          <w:rFonts w:ascii="Times" w:eastAsia="Times" w:hAnsi="Times" w:cs="Times"/>
-          <w:sz w:val="18"/>
-          <w:szCs w:val="18"/>
-        </w:rPr>
-        <w:t>0.0</w:t>
-      </w:r>
-    </w:p>
-    <w:p>
-      <w:r>
-        <w:rPr>
-          <w:rFonts w:ascii="Times" w:eastAsia="Times" w:hAnsi="Times" w:cs="Times"/>
-          <w:sz w:val="18"/>
-          <w:szCs w:val="18"/>
-        </w:rPr>
-        <w:t>Purpose &amp; Scope</w:t>
-      </w:r>
-      <w:r>
-        <w:tab/>
-      </w:r>
-      <w:r>
-        <w:tab/>
-      </w:r>
-      <w:r>
-        <w:tab/>
-      </w:r>
-      <w:r>
-        <w:tab/>
-      </w:r>
-      <w:r>
-        <w:tab/>
-      </w:r>
-      <w:r>
-        <w:tab/>
-      </w:r>
-      <w:r>
-        <w:tab/>
-      </w:r>
-      <w:r>
-        <w:tab/>
-      </w:r>
-      <w:r>
-        <w:tab/>
-      </w:r>
-      <w:r>
-        <w:tab/>
-      </w:r>
-      <w:r>
-        <w:rPr>
-          <w:rFonts w:ascii="Times" w:eastAsia="Times" w:hAnsi="Times" w:cs="Times"/>
-          <w:sz w:val="18"/>
-          <w:szCs w:val="18"/>
-        </w:rPr>
-        <w:t>1.0</w:t>
-      </w:r>
-    </w:p>
-    <w:p>
-      <w:r>
-        <w:rPr>
-          <w:rFonts w:ascii="Times" w:eastAsia="Times" w:hAnsi="Times" w:cs="Times"/>
-          <w:sz w:val="18"/>
-          <w:szCs w:val="18"/>
-        </w:rPr>
-        <w:t>Definitions</w:t>
-      </w:r>
-      <w:r>
-        <w:tab/>
-      </w:r>
-      <w:r>
-        <w:tab/>
-      </w:r>
-      <w:r>
-        <w:tab/>
-      </w:r>
-      <w:r>
-        <w:tab/>
-      </w:r>
-      <w:r>
-        <w:tab/>
-      </w:r>
-      <w:r>
-        <w:tab/>
-      </w:r>
-      <w:r>
-        <w:tab/>
-      </w:r>
-      <w:r>
-        <w:tab/>
-      </w:r>
-      <w:r>
-        <w:tab/>
-      </w:r>
-      <w:r>
-        <w:tab/>
-      </w:r>
-      <w:r>
-        <w:rPr>
-          <w:rFonts w:ascii="Times" w:eastAsia="Times" w:hAnsi="Times" w:cs="Times"/>
-          <w:sz w:val="18"/>
-          <w:szCs w:val="18"/>
-        </w:rPr>
-        <w:t>2.0</w:t>
-      </w:r>
-    </w:p>
-    <w:p>
-      <w:r>
-        <w:rPr>
-          <w:rFonts w:ascii="Times" w:eastAsia="Times" w:hAnsi="Times" w:cs="Times"/>
-          <w:sz w:val="18"/>
-          <w:szCs w:val="18"/>
-        </w:rPr>
-        <w:t>Background</w:t>
-      </w:r>
-      <w:r>
-        <w:tab/>
-      </w:r>
-      <w:r>
-        <w:tab/>
-      </w:r>
-      <w:r>
-        <w:tab/>
-      </w:r>
-      <w:r>
-        <w:tab/>
-      </w:r>
-      <w:r>
-        <w:tab/>
-      </w:r>
-      <w:r>
-        <w:tab/>
-      </w:r>
-      <w:r>
-        <w:tab/>
-      </w:r>
-      <w:r>
-        <w:tab/>
-      </w:r>
-      <w:r>
-        <w:tab/>
-      </w:r>
-      <w:r>
-        <w:tab/>
-      </w:r>
-      <w:r>
-        <w:rPr>
-          <w:rFonts w:ascii="Times" w:eastAsia="Times" w:hAnsi="Times" w:cs="Times"/>
-          <w:sz w:val="18"/>
-          <w:szCs w:val="18"/>
-        </w:rPr>
-        <w:t>3.0</w:t>
-      </w:r>
-    </w:p>
-    <w:p>
-      <w:r>
-        <w:rPr>
-          <w:rFonts w:ascii="Times" w:eastAsia="Times" w:hAnsi="Times" w:cs="Times"/>
-          <w:sz w:val="18"/>
-          <w:szCs w:val="18"/>
-        </w:rPr>
-        <w:t>Theoretical Framework</w:t>
-      </w:r>
-      <w:r>
-        <w:tab/>
-      </w:r>
-      <w:r>
-        <w:tab/>
-      </w:r>
-      <w:r>
-        <w:tab/>
-      </w:r>
-      <w:r>
-        <w:tab/>
-      </w:r>
-      <w:r>
-        <w:tab/>
-      </w:r>
-      <w:r>
-        <w:tab/>
-      </w:r>
-      <w:r>
-        <w:tab/>
-      </w:r>
-      <w:r>
-        <w:tab/>
-      </w:r>
-      <w:r>
-        <w:tab/>
-      </w:r>
-      <w:r>
-        <w:rPr>
-          <w:rFonts w:ascii="Times" w:eastAsia="Times" w:hAnsi="Times" w:cs="Times"/>
-          <w:sz w:val="18"/>
-          <w:szCs w:val="18"/>
-        </w:rPr>
-        <w:t>4.0</w:t>
-      </w:r>
-    </w:p>
-    <w:p>
-      <w:r>
-        <w:rPr>
-          <w:rFonts w:ascii="Times" w:eastAsia="Times" w:hAnsi="Times" w:cs="Times"/>
-          <w:sz w:val="18"/>
-          <w:szCs w:val="18"/>
-        </w:rPr>
-        <w:t>Materials &amp; Equipment</w:t>
-      </w:r>
-      <w:r>
-        <w:tab/>
-      </w:r>
-      <w:r>
-        <w:tab/>
-      </w:r>
-      <w:r>
-        <w:tab/>
-      </w:r>
-      <w:r>
-        <w:tab/>
-      </w:r>
-      <w:r>
-        <w:tab/>
-      </w:r>
-      <w:r>
-        <w:tab/>
-      </w:r>
-      <w:r>
-        <w:tab/>
-      </w:r>
-      <w:r>
-        <w:tab/>
-      </w:r>
-      <w:r>
-        <w:tab/>
-      </w:r>
-      <w:r>
-        <w:rPr>
-          <w:rFonts w:ascii="Times" w:eastAsia="Times" w:hAnsi="Times" w:cs="Times"/>
-          <w:sz w:val="18"/>
-          <w:szCs w:val="18"/>
-        </w:rPr>
-        <w:t>5.0</w:t>
-      </w:r>
-    </w:p>
-    <w:p>
-      <w:r>
-        <w:rPr>
-          <w:rFonts w:ascii="Times" w:eastAsia="Times" w:hAnsi="Times" w:cs="Times"/>
-          <w:sz w:val="18"/>
-          <w:szCs w:val="18"/>
-        </w:rPr>
-        <w:t>Sample Cleaning Procedure</w:t>
-      </w:r>
-      <w:r>
-        <w:tab/>
-      </w:r>
-      <w:r>
-        <w:tab/>
-      </w:r>
-      <w:r>
-        <w:tab/>
-      </w:r>
-      <w:r>
-        <w:tab/>
-      </w:r>
-      <w:r>
-        <w:tab/>
-      </w:r>
-      <w:r>
-        <w:tab/>
-      </w:r>
-      <w:r>
-        <w:tab/>
-      </w:r>
-      <w:r>
-        <w:tab/>
-      </w:r>
-      <w:r>
-        <w:tab/>
-      </w:r>
-      <w:r>
-        <w:rPr>
-          <w:rFonts w:ascii="Times" w:eastAsia="Times" w:hAnsi="Times" w:cs="Times"/>
-          <w:sz w:val="18"/>
-          <w:szCs w:val="18"/>
-        </w:rPr>
-        <w:t>6.0</w:t>
-      </w:r>
-    </w:p>
-    <w:p>
-      <w:r>
-        <w:rPr>
-          <w:rFonts w:ascii="Times" w:eastAsia="Times" w:hAnsi="Times" w:cs="Times"/>
-          <w:sz w:val="18"/>
-          <w:szCs w:val="18"/>
-        </w:rPr>
-        <w:t>Drying Procedure</w:t>
-      </w:r>
-      <w:r>
-        <w:tab/>
-      </w:r>
-      <w:r>
-        <w:tab/>
-      </w:r>
-      <w:r>
-        <w:tab/>
-      </w:r>
-      <w:r>
-        <w:tab/>
-      </w:r>
-      <w:r>
-        <w:tab/>
-      </w:r>
-      <w:r>
-        <w:tab/>
-      </w:r>
-      <w:r>
-        <w:tab/>
-      </w:r>
-      <w:r>
-        <w:tab/>
-      </w:r>
-      <w:r>
-        <w:tab/>
-      </w:r>
-      <w:r>
-        <w:tab/>
-      </w:r>
-      <w:r>
-        <w:rPr>
-          <w:rFonts w:ascii="Times" w:eastAsia="Times" w:hAnsi="Times" w:cs="Times"/>
-          <w:sz w:val="18"/>
-          <w:szCs w:val="18"/>
-        </w:rPr>
-        <w:t>7.0</w:t>
-      </w:r>
-    </w:p>
-    <w:p>
-      <w:r>
-        <w:rPr>
-          <w:rFonts w:ascii="Times" w:eastAsia="Times" w:hAnsi="Times" w:cs="Times"/>
-          <w:sz w:val="18"/>
-          <w:szCs w:val="18"/>
-        </w:rPr>
-        <w:t xml:space="preserve">Subsampling and </w:t>
-      </w:r>
-      <w:r>
-        <w:rPr>
-          <w:rFonts w:ascii="Times" w:eastAsia="Times" w:hAnsi="Times" w:cs="Times"/>
-          <w:sz w:val="18"/>
-          <w:szCs w:val="18"/>
-        </w:rPr>
-        <w:t>Encapsulation</w:t>
-      </w:r>
-      <w:r>
-        <w:tab/>
-      </w:r>
-      <w:r>
-        <w:tab/>
-      </w:r>
-      <w:r>
-        <w:tab/>
-      </w:r>
-      <w:r>
-        <w:tab/>
-      </w:r>
-      <w:r>
-        <w:tab/>
-      </w:r>
-      <w:r>
-        <w:tab/>
-      </w:r>
-      <w:r>
-        <w:tab/>
-      </w:r>
-      <w:r>
-        <w:tab/>
-      </w:r>
-      <w:r>
-        <w:rPr>
-          <w:rFonts w:ascii="Times" w:eastAsia="Times" w:hAnsi="Times" w:cs="Times"/>
-          <w:sz w:val="18"/>
-          <w:szCs w:val="18"/>
-        </w:rPr>
-        <w:t>8.0</w:t>
-      </w:r>
-    </w:p>
-    <w:p>
-      <w:r>
-        <w:rPr>
-          <w:rFonts w:ascii="Times" w:eastAsia="Times" w:hAnsi="Times" w:cs="Times"/>
-          <w:sz w:val="18"/>
-          <w:szCs w:val="18"/>
-        </w:rPr>
-        <w:t xml:space="preserve">Documentation </w:t>
-      </w:r>
-      <w:r>
-        <w:tab/>
-      </w:r>
-      <w:r>
-        <w:tab/>
-      </w:r>
-      <w:r>
-        <w:tab/>
-      </w:r>
-      <w:r>
-        <w:tab/>
-      </w:r>
-      <w:r>
-        <w:tab/>
-      </w:r>
-      <w:r>
-        <w:tab/>
-      </w:r>
-      <w:r>
-        <w:tab/>
-      </w:r>
-      <w:r>
-        <w:tab/>
-      </w:r>
-      <w:r>
-        <w:tab/>
-      </w:r>
-      <w:r>
-        <w:tab/>
-      </w:r>
-      <w:r>
-        <w:rPr>
-          <w:rFonts w:ascii="Times" w:eastAsia="Times" w:hAnsi="Times" w:cs="Times"/>
-          <w:sz w:val="18"/>
-          <w:szCs w:val="18"/>
-        </w:rPr>
-        <w:t>9.0</w:t>
-      </w:r>
-    </w:p>
-    <w:p>
-      <w:r>
-        <w:rPr>
-          <w:rFonts w:ascii="Times" w:eastAsia="Times" w:hAnsi="Times" w:cs="Times"/>
-          <w:sz w:val="18"/>
-          <w:szCs w:val="18"/>
-        </w:rPr>
-        <w:t>Quality Assurance &amp; Control</w:t>
-      </w:r>
-      <w:r>
-        <w:tab/>
-      </w:r>
-      <w:r>
-        <w:tab/>
-      </w:r>
-      <w:r>
-        <w:tab/>
-      </w:r>
-      <w:r>
-        <w:tab/>
-      </w:r>
-      <w:r>
-        <w:tab/>
-      </w:r>
-      <w:r>
-        <w:tab/>
-      </w:r>
-      <w:r>
-        <w:tab/>
-      </w:r>
-      <w:r>
-        <w:tab/>
-      </w:r>
-      <w:r>
-        <w:tab/>
-      </w:r>
-      <w:r>
-        <w:rPr>
-          <w:rFonts w:ascii="Times" w:eastAsia="Times" w:hAnsi="Times" w:cs="Times"/>
-          <w:sz w:val="18"/>
-          <w:szCs w:val="18"/>
-        </w:rPr>
-        <w:t>10.0</w:t>
-      </w:r>
-    </w:p>
-    <w:p>
-      <w:r>
-        <w:rPr>
-          <w:rFonts w:ascii="Times" w:eastAsia="Times" w:hAnsi="Times" w:cs="Times"/>
-          <w:sz w:val="18"/>
-          <w:szCs w:val="18"/>
-        </w:rPr>
-        <w:t>Safety Considerations</w:t>
-      </w:r>
-      <w:r>
-        <w:tab/>
-      </w:r>
-      <w:r>
-        <w:tab/>
-      </w:r>
-      <w:r>
-        <w:tab/>
-      </w:r>
-      <w:r>
-        <w:tab/>
-      </w:r>
-      <w:r>
-        <w:tab/>
-      </w:r>
-      <w:r>
-        <w:tab/>
-      </w:r>
-      <w:r>
-        <w:tab/>
-      </w:r>
-      <w:r>
-        <w:tab/>
-      </w:r>
-      <w:r>
-        <w:tab/>
-      </w:r>
-      <w:r>
-        <w:rPr>
-          <w:rFonts w:ascii="Times" w:eastAsia="Times" w:hAnsi="Times" w:cs="Times"/>
-          <w:sz w:val="18"/>
-          <w:szCs w:val="18"/>
-        </w:rPr>
-        <w:t>11.0</w:t>
-      </w:r>
-    </w:p>
-    <w:p>
-      <w:r>
-        <w:rPr>
-          <w:rFonts w:ascii="Times" w:eastAsia="Times" w:hAnsi="Times" w:cs="Times"/>
-          <w:sz w:val="18"/>
-          <w:szCs w:val="18"/>
-        </w:rPr>
-        <w:t>References Cited or Implied</w:t>
-      </w:r>
-      <w:r>
-        <w:tab/>
-      </w:r>
-      <w:r>
-        <w:tab/>
-      </w:r>
-      <w:r>
-        <w:tab/>
-      </w:r>
-      <w:r>
-        <w:tab/>
-      </w:r>
-      <w:r>
-        <w:tab/>
-      </w:r>
-      <w:r>
-        <w:tab/>
-      </w:r>
-      <w:r>
-        <w:tab/>
-      </w:r>
-      <w:r>
-        <w:tab/>
-      </w:r>
-      <w:r>
-        <w:tab/>
-      </w:r>
-      <w:r>
-        <w:rPr>
-          <w:rFonts w:ascii="Times" w:eastAsia="Times" w:hAnsi="Times" w:cs="Times"/>
-          <w:sz w:val="18"/>
-          <w:szCs w:val="18"/>
-        </w:rPr>
-        <w:t>12.0</w:t>
-      </w:r>
-    </w:p>
-    <w:p>
-      <w:pPr>
-        <w:rPr>
-          <w:rFonts w:ascii="Times" w:eastAsia="Times" w:hAnsi="Times" w:cs="Times"/>
-          <w:sz w:val="18"/>
-          <w:szCs w:val="18"/>
-        </w:rPr>
-      </w:pPr>
-    </w:p>
-    <w:p>
-      <w:pPr>
-        <w:rPr>
-          <w:rFonts w:ascii="Times" w:eastAsia="Times" w:hAnsi="Times" w:cs="Times"/>
-          <w:sz w:val="18"/>
-          <w:szCs w:val="18"/>
-        </w:rPr>
-      </w:pPr>
-    </w:p>
-    <w:p>
-      <w:pPr>
-        <w:rPr>
-          <w:rFonts w:ascii="Times" w:eastAsia="Times" w:hAnsi="Times" w:cs="Times"/>
-          <w:sz w:val="18"/>
-          <w:szCs w:val="18"/>
-        </w:rPr>
-      </w:pPr>
-      <w:r>
-        <w:rPr>
-          <w:rFonts w:ascii="Times" w:eastAsia="Times" w:hAnsi="Times" w:cs="Times"/>
-          <w:sz w:val="18"/>
-          <w:szCs w:val="18"/>
-        </w:rPr>
-        <w:t>Fingernail Sample Description and Acceptance Criteria</w:t>
-      </w:r>
-      <w:r>
-        <w:rPr>
-          <w:rFonts w:ascii="Times" w:eastAsia="Times" w:hAnsi="Times" w:cs="Times"/>
-          <w:sz w:val="18"/>
-          <w:szCs w:val="18"/>
-        </w:rPr>
-        <w:t xml:space="preserve">     </w:t>
-      </w:r>
-      <w:r>
-        <w:tab/>
-      </w:r>
-      <w:r>
-        <w:tab/>
-      </w:r>
-      <w:r>
-        <w:tab/>
-      </w:r>
-      <w:r>
-        <w:rPr>
-          <w:rFonts w:ascii="Times" w:eastAsia="Times" w:hAnsi="Times" w:cs="Times"/>
-          <w:sz w:val="18"/>
-          <w:szCs w:val="18"/>
-        </w:rPr>
-        <w:t xml:space="preserve">                             </w:t>
-      </w:r>
-      <w:r>
-        <w:tab/>
-      </w:r>
-      <w:r>
-        <w:rPr>
-          <w:rFonts w:ascii="Times" w:eastAsia="Times" w:hAnsi="Times" w:cs="Times"/>
-          <w:sz w:val="18"/>
-          <w:szCs w:val="18"/>
-        </w:rPr>
-        <w:t>Appendix A</w:t>
-      </w:r>
-    </w:p>
-    <w:p>
-      <w:pPr>
-        <w:rPr>
-          <w:rFonts w:ascii="Times" w:eastAsia="Times" w:hAnsi="Times" w:cs="Times"/>
-          <w:sz w:val="18"/>
-          <w:szCs w:val="18"/>
-        </w:rPr>
-      </w:pPr>
-      <w:r>
-        <w:rPr>
-          <w:rFonts w:ascii="Times" w:eastAsia="Times" w:hAnsi="Times" w:cs="Times"/>
-          <w:sz w:val="18"/>
-          <w:szCs w:val="18"/>
-        </w:rPr>
-        <w:t>Reagents and Solvent Specifications</w:t>
-      </w:r>
-      <w:r>
-        <w:tab/>
-      </w:r>
-      <w:r>
-        <w:tab/>
-      </w:r>
-      <w:r>
-        <w:tab/>
-      </w:r>
-      <w:r>
-        <w:tab/>
-      </w:r>
-      <w:r>
-        <w:tab/>
-      </w:r>
-      <w:r>
-        <w:tab/>
-      </w:r>
-      <w:r>
-        <w:tab/>
-      </w:r>
-      <w:r>
-        <w:rPr>
-          <w:rFonts w:ascii="Times" w:eastAsia="Times" w:hAnsi="Times" w:cs="Times"/>
-          <w:sz w:val="18"/>
-          <w:szCs w:val="18"/>
-        </w:rPr>
-        <w:t>Appendix B</w:t>
-      </w:r>
-    </w:p>
-    <w:p>
-      <w:pPr>
-        <w:rPr>
-          <w:rFonts w:ascii="Times" w:eastAsia="Times" w:hAnsi="Times" w:cs="Times"/>
-          <w:sz w:val="18"/>
-          <w:szCs w:val="18"/>
-        </w:rPr>
-      </w:pPr>
-      <w:r>
-        <w:rPr>
-          <w:rFonts w:ascii="Times" w:eastAsia="Times" w:hAnsi="Times" w:cs="Times"/>
-          <w:sz w:val="18"/>
-          <w:szCs w:val="18"/>
-        </w:rPr>
-        <w:t>Equipment Specifications</w:t>
-      </w:r>
-      <w:r>
-        <w:tab/>
-      </w:r>
-      <w:r>
-        <w:tab/>
-      </w:r>
-      <w:r>
-        <w:tab/>
-      </w:r>
-      <w:r>
-        <w:tab/>
-      </w:r>
-      <w:r>
-        <w:tab/>
-      </w:r>
-      <w:r>
-        <w:tab/>
-      </w:r>
-      <w:r>
-        <w:tab/>
-      </w:r>
-      <w:r>
-        <w:tab/>
-      </w:r>
-      <w:r>
-        <w:rPr>
-          <w:rFonts w:ascii="Times" w:eastAsia="Times" w:hAnsi="Times" w:cs="Times"/>
-          <w:sz w:val="18"/>
-          <w:szCs w:val="18"/>
-        </w:rPr>
-        <w:t>Appendix C</w:t>
-      </w:r>
-    </w:p>
-    <w:p>
-      <w:pPr>
-        <w:rPr>
-          <w:rFonts w:ascii="Times" w:eastAsia="Times" w:hAnsi="Times" w:cs="Times"/>
-          <w:sz w:val="18"/>
-          <w:szCs w:val="18"/>
-        </w:rPr>
-      </w:pPr>
-      <w:r>
-        <w:rPr>
-          <w:rFonts w:ascii="Times" w:eastAsia="Times" w:hAnsi="Times" w:cs="Times"/>
-          <w:sz w:val="18"/>
-          <w:szCs w:val="18"/>
-        </w:rPr>
-        <w:t xml:space="preserve">Fingernail Sample Cleaning Checklist </w:t>
-      </w:r>
-      <w:r>
-        <w:tab/>
-      </w:r>
-      <w:r>
-        <w:tab/>
-      </w:r>
-      <w:r>
-        <w:tab/>
-      </w:r>
-      <w:r>
-        <w:tab/>
-      </w:r>
-      <w:r>
-        <w:tab/>
-      </w:r>
-      <w:r>
-        <w:tab/>
-      </w:r>
-      <w:r>
-        <w:tab/>
-      </w:r>
-      <w:r>
-        <w:rPr>
-          <w:rFonts w:ascii="Times" w:eastAsia="Times" w:hAnsi="Times" w:cs="Times"/>
-          <w:sz w:val="18"/>
-          <w:szCs w:val="18"/>
-        </w:rPr>
-        <w:t>Appendix D</w:t>
-      </w:r>
-    </w:p>
-    <w:p>
-      <w:pPr>
-        <w:rPr>
-          <w:rFonts w:ascii="Times" w:eastAsia="Times" w:hAnsi="Times" w:cs="Times"/>
-          <w:sz w:val="18"/>
-          <w:szCs w:val="18"/>
-        </w:rPr>
-      </w:pPr>
-      <w:r>
-        <w:rPr>
-          <w:rFonts w:ascii="Times" w:eastAsia="Times" w:hAnsi="Times" w:cs="Times"/>
-          <w:sz w:val="18"/>
-          <w:szCs w:val="18"/>
-        </w:rPr>
-        <w:t xml:space="preserve">Subsampling and Encapsulation Guidelines </w:t>
-      </w:r>
-      <w:r>
-        <w:rPr>
-          <w:rFonts w:ascii="Times" w:eastAsia="Times" w:hAnsi="Times" w:cs="Times"/>
-          <w:sz w:val="18"/>
-          <w:szCs w:val="18"/>
-        </w:rPr>
-        <w:t xml:space="preserve">     </w:t>
-      </w:r>
-      <w:r>
-        <w:tab/>
-      </w:r>
-      <w:r>
-        <w:tab/>
-      </w:r>
-      <w:r>
-        <w:tab/>
-      </w:r>
-      <w:r>
-        <w:tab/>
-      </w:r>
-      <w:r>
-        <w:tab/>
-      </w:r>
-      <w:r>
-        <w:tab/>
-      </w:r>
-      <w:r>
-        <w:rPr>
-          <w:rFonts w:ascii="Times" w:eastAsia="Times" w:hAnsi="Times" w:cs="Times"/>
-          <w:sz w:val="18"/>
-          <w:szCs w:val="18"/>
-        </w:rPr>
-        <w:t xml:space="preserve">Appendix </w:t>
-      </w:r>
-      <w:r>
-        <w:rPr>
-          <w:rFonts w:ascii="Times" w:eastAsia="Times" w:hAnsi="Times" w:cs="Times"/>
-          <w:sz w:val="18"/>
-          <w:szCs w:val="18"/>
-        </w:rPr>
-        <w:t>E</w:t>
-      </w:r>
-    </w:p>
-    <w:p>
-      <w:pPr>
-        <w:rPr>
-          <w:rFonts w:ascii="Times" w:eastAsia="Times" w:hAnsi="Times" w:cs="Times"/>
-          <w:sz w:val="18"/>
-          <w:szCs w:val="18"/>
-        </w:rPr>
-      </w:pPr>
-      <w:r>
-        <w:rPr>
-          <w:rFonts w:ascii="Times" w:eastAsia="Times" w:hAnsi="Times" w:cs="Times"/>
-          <w:sz w:val="18"/>
-          <w:szCs w:val="18"/>
-        </w:rPr>
-        <w:t xml:space="preserve">Quality Assurance </w:t>
-      </w:r>
-      <w:r>
-        <w:rPr>
-          <w:rFonts w:ascii="Times" w:eastAsia="Times" w:hAnsi="Times" w:cs="Times"/>
-          <w:sz w:val="18"/>
-          <w:szCs w:val="18"/>
-        </w:rPr>
-        <w:t xml:space="preserve">and Contamination Control </w:t>
-      </w:r>
-      <w:r>
-        <w:tab/>
-      </w:r>
-      <w:r>
-        <w:tab/>
-      </w:r>
-      <w:r>
-        <w:tab/>
-      </w:r>
-      <w:r>
-        <w:tab/>
-      </w:r>
-      <w:r>
-        <w:tab/>
-      </w:r>
-      <w:r>
-        <w:tab/>
-      </w:r>
-      <w:r>
-        <w:rPr>
-          <w:rFonts w:ascii="Times" w:eastAsia="Times" w:hAnsi="Times" w:cs="Times"/>
-          <w:sz w:val="18"/>
-          <w:szCs w:val="18"/>
-        </w:rPr>
-        <w:t xml:space="preserve">Appendix </w:t>
-      </w:r>
-      <w:r>
-        <w:rPr>
-          <w:rFonts w:ascii="Times" w:eastAsia="Times" w:hAnsi="Times" w:cs="Times"/>
-          <w:sz w:val="18"/>
-          <w:szCs w:val="18"/>
-        </w:rPr>
-        <w:t>F</w:t>
-      </w:r>
-    </w:p>
-    <w:p>
-      <w:pPr>
-        <w:rPr>
-          <w:rFonts w:ascii="Times" w:eastAsia="Times" w:hAnsi="Times" w:cs="Times"/>
-          <w:sz w:val="18"/>
-          <w:szCs w:val="18"/>
-        </w:rPr>
-      </w:pPr>
-      <w:r>
-        <w:rPr>
-          <w:rFonts w:ascii="Times" w:eastAsia="Times" w:hAnsi="Times" w:cs="Times"/>
-          <w:sz w:val="18"/>
-          <w:szCs w:val="18"/>
-        </w:rPr>
-        <w:t xml:space="preserve">Safety and Waste Disposal </w:t>
-      </w:r>
-      <w:r>
-        <w:tab/>
-      </w:r>
       <w:r>
         <w:tab/>
       </w:r>
@@ -1272,7 +178,6 @@
           <w:sz w:val="20"/>
           <w:szCs w:val="20"/>
         </w:rPr>
-        <w:lastRenderedPageBreak/>
         <w:t xml:space="preserve">This SOP describes the procedures used to clean, dry, weigh, and encapsulate fingernail clippings prior to laboratory analysis. It applies to all personnel preparing fingernail samples for </w:t>
       </w:r>
       <w:r>
@@ -1970,6 +875,7 @@
           <w:sz w:val="20"/>
           <w:szCs w:val="20"/>
         </w:rPr>
+        <w:lastRenderedPageBreak/>
         <w:t>Fume hood</w:t>
       </w:r>
     </w:p>
@@ -2105,7 +1011,6 @@
           <w:sz w:val="20"/>
           <w:szCs w:val="20"/>
         </w:rPr>
-        <w:lastRenderedPageBreak/>
         <w:t>6.2 Organic Solvent Wash</w:t>
       </w:r>
     </w:p>
@@ -2820,6 +1725,7 @@
           <w:sz w:val="20"/>
           <w:szCs w:val="20"/>
         </w:rPr>
+        <w:lastRenderedPageBreak/>
         <w:t>Capsule ID</w:t>
       </w:r>
     </w:p>
@@ -2958,7 +1864,6 @@
           <w:b/>
           <w:bCs/>
         </w:rPr>
-        <w:lastRenderedPageBreak/>
         <w:t>11.0 Safety Considerations</w:t>
       </w:r>
     </w:p>
@@ -4776,10 +3681,10 @@
       </w:pPr>
     </w:p>
     <w:sectPr>
-      <w:headerReference w:type="default" r:id="rId8"/>
-      <w:footerReference w:type="default" r:id="rId9"/>
-      <w:headerReference w:type="first" r:id="rId10"/>
-      <w:footerReference w:type="first" r:id="rId11"/>
+      <w:headerReference w:type="default" r:id="rId7"/>
+      <w:footerReference w:type="default" r:id="rId8"/>
+      <w:headerReference w:type="first" r:id="rId9"/>
+      <w:footerReference w:type="first" r:id="rId10"/>
       <w:pgSz w:w="12240" w:h="15840"/>
       <w:pgMar w:top="1440" w:right="1440" w:bottom="1440" w:left="1440" w:header="720" w:footer="720" w:gutter="0"/>
       <w:cols w:space="720"/>

</xml_diff>